<commit_message>
v5.1 — two editions: Classic Projects and Threads
The course now ships in two editions built from one source:

- Classic Projects Edition (default; courseware/, labs/, /prompts/) teaches
  Projects as most accounts show them today: the Instructions, Context, Folder
  and Scheduled panels, parallel tasks started by the learner, a project memory
  file, and the Create scheduled task dialog. Adds "Coming soon" slides and an
  LG section on the new Projects with a lead agent and threads.
- Threads Edition (courseware/threads-edition/, labs-threads/,
  /prompts/threads/) keeps the redesigned Projects with a lead agent and
  parallel threads.

The prompts page gains the C34-style "Which lab are you on?" index and an
edition switch. The AI history slide follows the Agentic AI Applications with
Claude Code deck (2026: AI Agents). v5.0 deck moved to the archive.

Co-Authored-By: Claude Opus 5.5 <noreply@anthropic.com>
</commit_message>
<xml_diff>
--- a/courseware/LP-Claude AI Masterclass.docx
+++ b/courseware/LP-Claude AI Masterclass.docx
@@ -114,6 +114,20 @@
     </w:p>
     <w:p>
       <w:pPr>
+        <w:spacing w:before="40" w:after="40"/>
+        <w:jc w:val="center"/>
+      </w:pPr>
+      <w:r>
+        <w:rPr>
+          <w:b/>
+          <w:color w:val="1F6FEB"/>
+          <w:sz w:val="28"/>
+        </w:rPr>
+        <w:t>Classic Projects Edition</w:t>
+      </w:r>
+    </w:p>
+    <w:p>
+      <w:pPr>
         <w:spacing w:before="80" w:after="280"/>
         <w:jc w:val="center"/>
       </w:pPr>
@@ -179,7 +193,7 @@
           <w:color w:val="1F6FEB"/>
           <w:sz w:val="24"/>
         </w:rPr>
-        <w:t>Version 5.0 · 27 October 2026</w:t>
+        <w:t>Version 5.1 · 27 October 2026</w:t>
       </w:r>
     </w:p>
     <w:p>
@@ -864,6 +878,64 @@
           </w:p>
         </w:tc>
       </w:tr>
+      <w:tr>
+        <w:tc>
+          <w:tcPr>
+            <w:tcW w:type="dxa" w:w="1152"/>
+          </w:tcPr>
+          <w:p>
+            <w:r/>
+            <w:r>
+              <w:rPr>
+                <w:sz w:val="19"/>
+              </w:rPr>
+              <w:t>5.1</w:t>
+            </w:r>
+          </w:p>
+        </w:tc>
+        <w:tc>
+          <w:tcPr>
+            <w:tcW w:type="dxa" w:w="1728"/>
+          </w:tcPr>
+          <w:p>
+            <w:r/>
+            <w:r>
+              <w:rPr>
+                <w:sz w:val="19"/>
+              </w:rPr>
+              <w:t>27 October 2026</w:t>
+            </w:r>
+          </w:p>
+        </w:tc>
+        <w:tc>
+          <w:tcPr>
+            <w:tcW w:type="dxa" w:w="4320"/>
+          </w:tcPr>
+          <w:p>
+            <w:r/>
+            <w:r>
+              <w:rPr>
+                <w:sz w:val="19"/>
+              </w:rPr>
+              <w:t>Issued in two editions from one source. The Classic Projects Edition teaches Projects as most accounts show them today — Instructions, Context, Folder and Scheduled panels, with parallel tasks started by the learner and a project memory file — and is the edition distributed to learners. The Threads Edition keeps the redesigned Projects with a lead agent and parallel threads. The prompts page adds a lab index and links the two editions; the AI history slide follows the Agentic AI Applications with Claude Code deck.</w:t>
+            </w:r>
+          </w:p>
+        </w:tc>
+        <w:tc>
+          <w:tcPr>
+            <w:tcW w:type="dxa" w:w="1440"/>
+          </w:tcPr>
+          <w:p>
+            <w:r/>
+            <w:r>
+              <w:rPr>
+                <w:sz w:val="19"/>
+              </w:rPr>
+              <w:t>Dr. Alfred Ang</w:t>
+            </w:r>
+          </w:p>
+        </w:tc>
+      </w:tr>
     </w:tbl>
     <w:p>
       <w:r>
@@ -1046,6 +1118,38 @@
                 <w:sz w:val="20"/>
               </w:rPr>
               <w:t>Claude AI Masterclass</w:t>
+            </w:r>
+          </w:p>
+        </w:tc>
+      </w:tr>
+      <w:tr>
+        <w:tc>
+          <w:tcPr>
+            <w:tcW w:type="dxa" w:w="2304"/>
+            <w:shd w:val="clear" w:color="auto" w:fill="E8F0FE"/>
+          </w:tcPr>
+          <w:p>
+            <w:r/>
+            <w:r>
+              <w:rPr>
+                <w:b/>
+                <w:sz w:val="20"/>
+              </w:rPr>
+              <w:t>Edition</w:t>
+            </w:r>
+          </w:p>
+        </w:tc>
+        <w:tc>
+          <w:tcPr>
+            <w:tcW w:type="dxa" w:w="6336"/>
+          </w:tcPr>
+          <w:p>
+            <w:r/>
+            <w:r>
+              <w:rPr>
+                <w:sz w:val="20"/>
+              </w:rPr>
+              <w:t>Classic Projects Edition</w:t>
             </w:r>
           </w:p>
         </w:tc>
@@ -1296,7 +1400,7 @@
         <w:rPr>
           <w:sz w:val="21"/>
         </w:rPr>
-        <w:t>LO1: Set up a Claude Project with a goal, instructions, context and memory, and explain how its lead agent splits work into parallel threads.</w:t>
+        <w:t>LO1: Set up a Claude Project in Cowork with instructions, context, a working folder and a project memory file.</w:t>
       </w:r>
     </w:p>
     <w:p>
@@ -1307,7 +1411,7 @@
         <w:rPr>
           <w:sz w:val="21"/>
         </w:rPr>
-        <w:t>LO2: Run multi-subject market research as parallel threads and consolidate it into one verified research brief.</w:t>
+        <w:t>LO2: Run multi-subject market research as parallel tasks in one project and consolidate it into one verified research brief.</w:t>
       </w:r>
     </w:p>
     <w:p>
@@ -1362,7 +1466,7 @@
         <w:rPr>
           <w:sz w:val="21"/>
         </w:rPr>
-        <w:t>LO7: Create a two-week, multi-platform set of social media posts in parallel threads using the brand-voice skill.</w:t>
+        <w:t>LO7: Create a two-week, multi-platform set of social media posts using the brand-voice skill.</w:t>
       </w:r>
     </w:p>
     <w:p>
@@ -1384,7 +1488,7 @@
         <w:rPr>
           <w:sz w:val="21"/>
         </w:rPr>
-        <w:t>LO9: Schedule recurring project tasks, maintain project memory and review thread usage, keeping a human approval step.</w:t>
+        <w:t>LO9: Schedule recurring project tasks and keep the project's instructions, context and memory file current, with a human approval step.</w:t>
       </w:r>
     </w:p>
     <w:p>
@@ -1636,7 +1740,7 @@
                 <w:b/>
                 <w:sz w:val="19"/>
               </w:rPr>
-              <w:t>Topic 1 — Claude Projects and Market Research: the Claude family, setup, the new Projects, lead agent and threads, goal, instructions, context and memory</w:t>
+              <w:t>Topic 1 — Claude Projects and Market Research: the Claude family, setup, Projects in Cowork, instructions, context, folder and scheduled</w:t>
             </w:r>
           </w:p>
         </w:tc>
@@ -1789,7 +1893,7 @@
                 <w:b w:val="0"/>
                 <w:sz w:val="19"/>
               </w:rPr>
-              <w:t>Hands-on: Lab 2: Run Market Research in Parallel Threads</w:t>
+              <w:t>Hands-on: Lab 2: Run Market Research in Parallel Tasks</w:t>
             </w:r>
           </w:p>
         </w:tc>
@@ -2410,7 +2514,7 @@
                 <w:b/>
                 <w:sz w:val="19"/>
               </w:rPr>
-              <w:t>Topic 3 — Content Production and Scheduled Work: threads per channel, the video pipeline, scheduled tasks</w:t>
+              <w:t>Topic 3 — Content Production and Scheduled Work: platform specs, the video pipeline, scheduled tasks</w:t>
             </w:r>
           </w:p>
         </w:tc>
@@ -2460,7 +2564,7 @@
                 <w:b w:val="0"/>
                 <w:sz w:val="19"/>
               </w:rPr>
-              <w:t>Hands-on: Lab 8: Create Social Media Posts in Parallel Threads</w:t>
+              <w:t>Hands-on: Lab 8: Create Two Weeks of Social Media Posts</w:t>
             </w:r>
           </w:p>
         </w:tc>
@@ -2786,7 +2890,7 @@
               </w:rPr>
               <w:t>Lab 1: Set Up the Lumo Launch Project</w:t>
               <w:br/>
-              <w:t>Lab 2: Run Market Research in Parallel Threads</w:t>
+              <w:t>Lab 2: Run Market Research in Parallel Tasks</w:t>
               <w:br/>
               <w:t>Lab 3: Build the Market Insights Live Artefact</w:t>
             </w:r>
@@ -2913,7 +3017,7 @@
                 <w:b w:val="0"/>
                 <w:sz w:val="19"/>
               </w:rPr>
-              <w:t>Lab 8: Create Social Media Posts in Parallel Threads</w:t>
+              <w:t>Lab 8: Create Two Weeks of Social Media Posts</w:t>
               <w:br/>
               <w:t>Lab 9: Produce a 15-Second Launch Video</w:t>
               <w:br/>

</xml_diff>

<commit_message>
v5.2 — project concepts, pricing and models, scheduled posts, class screenshots
- Topic 1: Project vs Session, session diagram (Classic) / project-session-thread-agent
  diagram (Threads), A Project Answers Four Questions (HOW, WHAT, WHERE, WHEN),
  Instructions vs Context, the project-room analogy.
- Pricing slide updated (Free, Pro, Max, Team, Enterprise); new Claude models slide.
- Every lab gains an "In the project" panel; Lab 7 builds a Next Lumo post mod;
  Lab 8 schedules the daily post; Lab 10 schedules the weekly report.
- Seventeen annotated screenshots from the class delivery in the deck and LG.
- v5.1 decks moved to courseware/archive/.

Co-Authored-By: Claude Opus 5.5 <noreply@anthropic.com>
</commit_message>
<xml_diff>
--- a/courseware/LP-Claude AI Masterclass.docx
+++ b/courseware/LP-Claude AI Masterclass.docx
@@ -193,7 +193,7 @@
           <w:color w:val="1F6FEB"/>
           <w:sz w:val="24"/>
         </w:rPr>
-        <w:t>Version 5.1 · 27 October 2026</w:t>
+        <w:t>Version 5.2 · 27 October 2026</w:t>
       </w:r>
     </w:p>
     <w:p>
@@ -936,6 +936,64 @@
           </w:p>
         </w:tc>
       </w:tr>
+      <w:tr>
+        <w:tc>
+          <w:tcPr>
+            <w:tcW w:type="dxa" w:w="1152"/>
+          </w:tcPr>
+          <w:p>
+            <w:r/>
+            <w:r>
+              <w:rPr>
+                <w:sz w:val="19"/>
+              </w:rPr>
+              <w:t>5.2</w:t>
+            </w:r>
+          </w:p>
+        </w:tc>
+        <w:tc>
+          <w:tcPr>
+            <w:tcW w:type="dxa" w:w="1728"/>
+          </w:tcPr>
+          <w:p>
+            <w:r/>
+            <w:r>
+              <w:rPr>
+                <w:sz w:val="19"/>
+              </w:rPr>
+              <w:t>27 October 2026</w:t>
+            </w:r>
+          </w:p>
+        </w:tc>
+        <w:tc>
+          <w:tcPr>
+            <w:tcW w:type="dxa" w:w="4320"/>
+          </w:tcPr>
+          <w:p>
+            <w:r/>
+            <w:r>
+              <w:rPr>
+                <w:sz w:val="19"/>
+              </w:rPr>
+              <w:t>Topic 1 adds Project vs Session, a diagram of how sessions sit in a project (Classic) or how project, session, thread and agent relate (Threads), A Project Answers Four Questions (Instructions HOW, Context WHAT, Folder WHERE, Scheduled WHEN), Instructions vs Context and the project-room analogy; the pricing slide is updated (Free, Pro, Max, Team and Enterprise) and a Claude models slide added (Haiku, Sonnet, Opus, Fable). Every lab gains an In the project panel. Lab 7 builds a Next Lumo post mod; Lab 8 now schedules the daily post; Lab 10 schedules the weekly report. Timetable rebalanced (Lab 7 25 min, Lab 8 40 min, Lab 10 20 min). Glossary adds Context, Instructions and Session. Seventeen annotated screenshots from the class delivery added to the deck and LG: plan and usage, model and effort menus, permission mode, the project page and + menu, the Gmail connector, installing a skill, and the Lab 3, Lab 4 and Lab 8 outputs.</w:t>
+            </w:r>
+          </w:p>
+        </w:tc>
+        <w:tc>
+          <w:tcPr>
+            <w:tcW w:type="dxa" w:w="1440"/>
+          </w:tcPr>
+          <w:p>
+            <w:r/>
+            <w:r>
+              <w:rPr>
+                <w:sz w:val="19"/>
+              </w:rPr>
+              <w:t>Dr. Alfred Ang</w:t>
+            </w:r>
+          </w:p>
+        </w:tc>
+      </w:tr>
     </w:tbl>
     <w:p>
       <w:r>
@@ -971,7 +1029,7 @@
         </w:rPr>
         <w:t>Course Information</w:t>
         <w:tab/>
-        <w:t>4</w:t>
+        <w:t>5</w:t>
       </w:r>
     </w:p>
     <w:p>
@@ -990,7 +1048,7 @@
         </w:rPr>
         <w:t>Learning Outcomes</w:t>
         <w:tab/>
-        <w:t>4</w:t>
+        <w:t>5</w:t>
       </w:r>
     </w:p>
     <w:p>
@@ -1009,7 +1067,7 @@
         </w:rPr>
         <w:t>Learning Reinforcement</w:t>
         <w:tab/>
-        <w:t>4</w:t>
+        <w:t>5</w:t>
       </w:r>
     </w:p>
     <w:p>
@@ -1028,7 +1086,7 @@
         </w:rPr>
         <w:t>Course Schedule</w:t>
         <w:tab/>
-        <w:t>5</w:t>
+        <w:t>6</w:t>
       </w:r>
     </w:p>
     <w:p>
@@ -1048,7 +1106,7 @@
         </w:rPr>
         <w:t>Day 1 — From a blank project to a researched, branded, scheduled product launch</w:t>
         <w:tab/>
-        <w:t>5</w:t>
+        <w:t>6</w:t>
       </w:r>
     </w:p>
     <w:p>
@@ -1067,7 +1125,7 @@
         </w:rPr>
         <w:t>Lab Reference (aligned to course topics)</w:t>
         <w:tab/>
-        <w:t>6</w:t>
+        <w:t>7</w:t>
       </w:r>
     </w:p>
     <w:p>
@@ -1740,7 +1798,7 @@
                 <w:b/>
                 <w:sz w:val="19"/>
               </w:rPr>
-              <w:t>Topic 1 — Claude Projects and Market Research: the Claude family, setup, Projects in Cowork, instructions, context, folder and scheduled</w:t>
+              <w:t>Topic 1 — Claude Projects and Market Research: the Claude family, setup, Projects in Cowork, project vs session, how, what, where and when (instructions, context, folder, scheduled), the project-room analogy</w:t>
             </w:r>
           </w:p>
         </w:tc>
@@ -2411,7 +2469,7 @@
                 <w:b/>
                 <w:sz w:val="19"/>
               </w:rPr>
-              <w:t>Topic 2 — Plugins and mods: skills versus plugins, Discover, namespaced commands</w:t>
+              <w:t>Topic 2 — Plugins and mods: skills versus plugins, Discover, namespaced commands, building a mod</w:t>
             </w:r>
           </w:p>
         </w:tc>
@@ -2429,7 +2487,7 @@
                 <w:b w:val="0"/>
                 <w:sz w:val="19"/>
               </w:rPr>
-              <w:t>15:40–16:00</w:t>
+              <w:t>15:40–16:05</w:t>
             </w:r>
           </w:p>
         </w:tc>
@@ -2445,7 +2503,7 @@
                 <w:b w:val="0"/>
                 <w:sz w:val="19"/>
               </w:rPr>
-              <w:t>20 min</w:t>
+              <w:t>25 min</w:t>
             </w:r>
           </w:p>
         </w:tc>
@@ -2461,7 +2519,7 @@
                 <w:b w:val="0"/>
                 <w:sz w:val="19"/>
               </w:rPr>
-              <w:t>Hands-on: Lab 7: Add the Marketing Plugin</w:t>
+              <w:t>Hands-on: Lab 7: Add the Marketing Plugin and a Mod</w:t>
             </w:r>
           </w:p>
         </w:tc>
@@ -2480,7 +2538,7 @@
                 <w:b/>
                 <w:sz w:val="19"/>
               </w:rPr>
-              <w:t>16:00–16:10</w:t>
+              <w:t>16:05–16:15</w:t>
             </w:r>
           </w:p>
         </w:tc>
@@ -2532,7 +2590,7 @@
                 <w:b w:val="0"/>
                 <w:sz w:val="19"/>
               </w:rPr>
-              <w:t>16:10–16:45</w:t>
+              <w:t>16:15–16:55</w:t>
             </w:r>
           </w:p>
         </w:tc>
@@ -2548,7 +2606,7 @@
                 <w:b w:val="0"/>
                 <w:sz w:val="19"/>
               </w:rPr>
-              <w:t>35 min</w:t>
+              <w:t>40 min</w:t>
             </w:r>
           </w:p>
         </w:tc>
@@ -2564,7 +2622,7 @@
                 <w:b w:val="0"/>
                 <w:sz w:val="19"/>
               </w:rPr>
-              <w:t>Hands-on: Lab 8: Create Two Weeks of Social Media Posts</w:t>
+              <w:t>Hands-on: Lab 8: Create and Schedule Two Weeks of Social Posts</w:t>
             </w:r>
           </w:p>
         </w:tc>
@@ -2582,7 +2640,7 @@
                 <w:b w:val="0"/>
                 <w:sz w:val="19"/>
               </w:rPr>
-              <w:t>16:45–17:15</w:t>
+              <w:t>16:55–17:25</w:t>
             </w:r>
           </w:p>
         </w:tc>
@@ -2632,7 +2690,7 @@
                 <w:b w:val="0"/>
                 <w:sz w:val="19"/>
               </w:rPr>
-              <w:t>17:15–17:45</w:t>
+              <w:t>17:25–17:45</w:t>
             </w:r>
           </w:p>
         </w:tc>
@@ -2648,7 +2706,7 @@
                 <w:b w:val="0"/>
                 <w:sz w:val="19"/>
               </w:rPr>
-              <w:t>30 min</w:t>
+              <w:t>20 min</w:t>
             </w:r>
           </w:p>
         </w:tc>
@@ -2664,7 +2722,7 @@
                 <w:b w:val="0"/>
                 <w:sz w:val="19"/>
               </w:rPr>
-              <w:t>Hands-on: Lab 10: Schedule the Posts and Review the Project</w:t>
+              <w:t>Hands-on: Lab 10: Schedule the Weekly Report and Review the Project</w:t>
             </w:r>
           </w:p>
         </w:tc>
@@ -2937,7 +2995,7 @@
                 <w:b w:val="0"/>
                 <w:sz w:val="19"/>
               </w:rPr>
-              <w:t>160 min (2 h 40 min)</w:t>
+              <w:t>165 min (2 h 45 min)</w:t>
             </w:r>
           </w:p>
         </w:tc>
@@ -2962,7 +3020,7 @@
               <w:br/>
               <w:t>Lab 6: Capture the Brand Voice as an Agent Skill</w:t>
               <w:br/>
-              <w:t>Lab 7: Add the Marketing Plugin</w:t>
+              <w:t>Lab 7: Add the Marketing Plugin and a Mod</w:t>
             </w:r>
           </w:p>
         </w:tc>
@@ -3001,7 +3059,7 @@
                 <w:b w:val="0"/>
                 <w:sz w:val="19"/>
               </w:rPr>
-              <w:t>105 min (1 h 45 min)</w:t>
+              <w:t>100 min (1 h 40 min)</w:t>
             </w:r>
           </w:p>
         </w:tc>
@@ -3017,11 +3075,11 @@
                 <w:b w:val="0"/>
                 <w:sz w:val="19"/>
               </w:rPr>
-              <w:t>Lab 8: Create Two Weeks of Social Media Posts</w:t>
+              <w:t>Lab 8: Create and Schedule Two Weeks of Social Posts</w:t>
               <w:br/>
               <w:t>Lab 9: Produce a 15-Second Launch Video</w:t>
               <w:br/>
-              <w:t>Lab 10: Schedule the Posts and Review the Project</w:t>
+              <w:t>Lab 10: Schedule the Weekly Report and Review the Project</w:t>
             </w:r>
           </w:p>
         </w:tc>

</xml_diff>